<commit_message>
Fix rejection letters: remove remaining Missouri addresses and all-caps URLs
- rejection-conflict.docx, rejection-over-income.docx: replace MMLS letterhead
  addresses (117 NORTH GARTH AVENUE, COLUMBIA MISSOURI 65203, Jefferson City
  office address) and parenthesized phone numbers ((573) 442-0116, etc.) that
  were missed by the initial replacement pass due to format differences
- rejection-lack-resources.docx: replace INDIANALEGALSERVICES.ORG all-caps
  footer URL that was missed due to case sensitivity

Co-authored-by: Copilot <223556219+Copilot@users.noreply.github.com>
</commit_message>
<xml_diff>
--- a/static/templates/rejection-conflict.docx
+++ b/static/templates/rejection-conflict.docx
@@ -73,7 +73,7 @@
                 <w:sz w:val="24"/>
                 <w:szCs w:val="24"/>
               </w:rPr>
-              <w:t>117 NORTH GARTH AVENUE</w:t>
+              <w:t>123 LEGAL AVENUE, SUITE 100</w:t>
             </w:r>
           </w:p>
           <w:p>
@@ -92,7 +92,7 @@
                 <w:sz w:val="24"/>
                 <w:szCs w:val="24"/>
               </w:rPr>
-              <w:t>COLUMBIA, MISSOURI 65203</w:t>
+              <w:t>ANYTOWN, ST 00000</w:t>
             </w:r>
           </w:p>
           <w:p>
@@ -515,75 +515,75 @@
                 <w:sz w:val="16"/>
                 <w:szCs w:val="16"/>
               </w:rPr>
-              <w:t>Columbia Office</w:t>
-            </w:r>
-          </w:p>
-          <w:p>
-            <w:pPr>
-              <w:rPr>
-                <w:rFonts w:ascii="Bookman Old Style" w:hAnsi="Bookman Old Style" w:cs="Arial"/>
-                <w:sz w:val="16"/>
-                <w:szCs w:val="16"/>
-              </w:rPr>
-            </w:pPr>
-            <w:r>
-              <w:rPr>
-                <w:rFonts w:ascii="Bookman Old Style" w:hAnsi="Bookman Old Style" w:cs="Arial"/>
-                <w:sz w:val="16"/>
-                <w:szCs w:val="16"/>
-              </w:rPr>
-              <w:t>117 North Garth Avenue</w:t>
-            </w:r>
-          </w:p>
-          <w:p>
-            <w:pPr>
-              <w:rPr>
-                <w:rFonts w:ascii="Bookman Old Style" w:hAnsi="Bookman Old Style" w:cs="Arial"/>
-                <w:sz w:val="16"/>
-                <w:szCs w:val="16"/>
-              </w:rPr>
-            </w:pPr>
-            <w:r>
-              <w:rPr>
-                <w:rFonts w:ascii="Bookman Old Style" w:hAnsi="Bookman Old Style" w:cs="Arial"/>
-                <w:sz w:val="16"/>
-                <w:szCs w:val="16"/>
-              </w:rPr>
-              <w:t>Columbia, MO 65203</w:t>
-            </w:r>
-          </w:p>
-          <w:p>
-            <w:pPr>
-              <w:rPr>
-                <w:rFonts w:ascii="Bookman Old Style" w:hAnsi="Bookman Old Style" w:cs="Arial"/>
-                <w:sz w:val="16"/>
-                <w:szCs w:val="16"/>
-              </w:rPr>
-            </w:pPr>
-            <w:r>
-              <w:rPr>
-                <w:rFonts w:ascii="Bookman Old Style" w:hAnsi="Bookman Old Style" w:cs="Arial"/>
-                <w:sz w:val="16"/>
-                <w:szCs w:val="16"/>
-              </w:rPr>
-              <w:t>(573) 442-0116</w:t>
-            </w:r>
-          </w:p>
-          <w:p>
-            <w:pPr>
-              <w:rPr>
-                <w:rFonts w:ascii="Bookman Old Style" w:hAnsi="Bookman Old Style" w:cs="Arial"/>
-                <w:sz w:val="16"/>
-                <w:szCs w:val="16"/>
-              </w:rPr>
-            </w:pPr>
-            <w:r>
-              <w:rPr>
-                <w:rFonts w:ascii="Bookman Old Style" w:hAnsi="Bookman Old Style" w:cs="Arial"/>
-                <w:sz w:val="16"/>
-                <w:szCs w:val="16"/>
-              </w:rPr>
-              <w:t>(573) 875-0173 fax</w:t>
+              <w:t>Main Office</w:t>
+            </w:r>
+          </w:p>
+          <w:p>
+            <w:pPr>
+              <w:rPr>
+                <w:rFonts w:ascii="Bookman Old Style" w:hAnsi="Bookman Old Style" w:cs="Arial"/>
+                <w:sz w:val="16"/>
+                <w:szCs w:val="16"/>
+              </w:rPr>
+            </w:pPr>
+            <w:r>
+              <w:rPr>
+                <w:rFonts w:ascii="Bookman Old Style" w:hAnsi="Bookman Old Style" w:cs="Arial"/>
+                <w:sz w:val="16"/>
+                <w:szCs w:val="16"/>
+              </w:rPr>
+              <w:t>123 Legal Avenue, Suite 100</w:t>
+            </w:r>
+          </w:p>
+          <w:p>
+            <w:pPr>
+              <w:rPr>
+                <w:rFonts w:ascii="Bookman Old Style" w:hAnsi="Bookman Old Style" w:cs="Arial"/>
+                <w:sz w:val="16"/>
+                <w:szCs w:val="16"/>
+              </w:rPr>
+            </w:pPr>
+            <w:r>
+              <w:rPr>
+                <w:rFonts w:ascii="Bookman Old Style" w:hAnsi="Bookman Old Style" w:cs="Arial"/>
+                <w:sz w:val="16"/>
+                <w:szCs w:val="16"/>
+              </w:rPr>
+              <w:t>Anytown, ST 00000</w:t>
+            </w:r>
+          </w:p>
+          <w:p>
+            <w:pPr>
+              <w:rPr>
+                <w:rFonts w:ascii="Bookman Old Style" w:hAnsi="Bookman Old Style" w:cs="Arial"/>
+                <w:sz w:val="16"/>
+                <w:szCs w:val="16"/>
+              </w:rPr>
+            </w:pPr>
+            <w:r>
+              <w:rPr>
+                <w:rFonts w:ascii="Bookman Old Style" w:hAnsi="Bookman Old Style" w:cs="Arial"/>
+                <w:sz w:val="16"/>
+                <w:szCs w:val="16"/>
+              </w:rPr>
+              <w:t>(555) 000-0001</w:t>
+            </w:r>
+          </w:p>
+          <w:p>
+            <w:pPr>
+              <w:rPr>
+                <w:rFonts w:ascii="Bookman Old Style" w:hAnsi="Bookman Old Style" w:cs="Arial"/>
+                <w:sz w:val="16"/>
+                <w:szCs w:val="16"/>
+              </w:rPr>
+            </w:pPr>
+            <w:r>
+              <w:rPr>
+                <w:rFonts w:ascii="Bookman Old Style" w:hAnsi="Bookman Old Style" w:cs="Arial"/>
+                <w:sz w:val="16"/>
+                <w:szCs w:val="16"/>
+              </w:rPr>
+              <w:t>(555) 000-0002 fax</w:t>
             </w:r>
           </w:p>
           <w:p>
@@ -637,7 +637,7 @@
                 <w:sz w:val="16"/>
                 <w:szCs w:val="16"/>
               </w:rPr>
-              <w:t>Jefferson City Office</w:t>
+              <w:t>Branch Office</w:t>
             </w:r>
           </w:p>
           <w:p>
@@ -672,41 +672,41 @@
                 <w:sz w:val="16"/>
                 <w:szCs w:val="16"/>
               </w:rPr>
-              <w:t>Jefferson City, MO 65101</w:t>
-            </w:r>
-          </w:p>
-          <w:p>
-            <w:pPr>
-              <w:rPr>
-                <w:rFonts w:ascii="Bookman Old Style" w:hAnsi="Bookman Old Style" w:cs="Arial"/>
-                <w:sz w:val="16"/>
-                <w:szCs w:val="16"/>
-              </w:rPr>
-            </w:pPr>
-            <w:r>
-              <w:rPr>
-                <w:rFonts w:ascii="Bookman Old Style" w:hAnsi="Bookman Old Style" w:cs="Arial"/>
-                <w:sz w:val="16"/>
-                <w:szCs w:val="16"/>
-              </w:rPr>
-              <w:t>(573) 634-4545</w:t>
-            </w:r>
-          </w:p>
-          <w:p>
-            <w:pPr>
-              <w:rPr>
-                <w:rFonts w:ascii="Bookman Old Style" w:hAnsi="Bookman Old Style" w:cs="Arial"/>
-                <w:sz w:val="16"/>
-                <w:szCs w:val="16"/>
-              </w:rPr>
-            </w:pPr>
-            <w:r>
-              <w:rPr>
-                <w:rFonts w:ascii="Bookman Old Style" w:hAnsi="Bookman Old Style" w:cs="Arial"/>
-                <w:sz w:val="16"/>
-                <w:szCs w:val="16"/>
-              </w:rPr>
-              <w:t>(573) 634-2973 fax</w:t>
+              <w:t>Othertown, ST 00001</w:t>
+            </w:r>
+          </w:p>
+          <w:p>
+            <w:pPr>
+              <w:rPr>
+                <w:rFonts w:ascii="Bookman Old Style" w:hAnsi="Bookman Old Style" w:cs="Arial"/>
+                <w:sz w:val="16"/>
+                <w:szCs w:val="16"/>
+              </w:rPr>
+            </w:pPr>
+            <w:r>
+              <w:rPr>
+                <w:rFonts w:ascii="Bookman Old Style" w:hAnsi="Bookman Old Style" w:cs="Arial"/>
+                <w:sz w:val="16"/>
+                <w:szCs w:val="16"/>
+              </w:rPr>
+              <w:t>(555) 000-0003</w:t>
+            </w:r>
+          </w:p>
+          <w:p>
+            <w:pPr>
+              <w:rPr>
+                <w:rFonts w:ascii="Bookman Old Style" w:hAnsi="Bookman Old Style" w:cs="Arial"/>
+                <w:sz w:val="16"/>
+                <w:szCs w:val="16"/>
+              </w:rPr>
+            </w:pPr>
+            <w:r>
+              <w:rPr>
+                <w:rFonts w:ascii="Bookman Old Style" w:hAnsi="Bookman Old Style" w:cs="Arial"/>
+                <w:sz w:val="16"/>
+                <w:szCs w:val="16"/>
+              </w:rPr>
+              <w:t>(555) 000-0004 fax</w:t>
             </w:r>
           </w:p>
           <w:p>

</xml_diff>

<commit_message>
Remove MMLS staff name letterhead table from rejection letters
Delete the entire letterhead table (which listed real staff names, titles,
and office addresses) from rejection-conflict.docx and rejection-over-income.docx.
The table was not needed as a template example; the letter body is sufficient.

Co-authored-by: Copilot <223556219+Copilot@users.noreply.github.com>
</commit_message>
<xml_diff>
--- a/static/templates/rejection-conflict.docx
+++ b/static/templates/rejection-conflict.docx
@@ -143,97 +143,6 @@
               </w:rPr>
             </w:pPr>
           </w:p>
-          <w:p>
-            <w:pPr>
-              <w:rPr>
-                <w:rFonts w:ascii="Bookman Old Style" w:hAnsi="Bookman Old Style" w:cs="Arial"/>
-                <w:b/>
-                <w:sz w:val="16"/>
-                <w:szCs w:val="16"/>
-              </w:rPr>
-            </w:pPr>
-            <w:r>
-              <w:rPr>
-                <w:rFonts w:ascii="Bookman Old Style" w:hAnsi="Bookman Old Style" w:cs="Arial"/>
-                <w:b/>
-                <w:sz w:val="16"/>
-                <w:szCs w:val="16"/>
-              </w:rPr>
-              <w:t>Executive Director</w:t>
-            </w:r>
-          </w:p>
-          <w:p>
-            <w:pPr>
-              <w:rPr>
-                <w:rFonts w:ascii="Bookman Old Style" w:hAnsi="Bookman Old Style" w:cs="Arial"/>
-                <w:sz w:val="16"/>
-                <w:szCs w:val="16"/>
-              </w:rPr>
-            </w:pPr>
-            <w:r>
-              <w:rPr>
-                <w:rFonts w:ascii="Bookman Old Style" w:hAnsi="Bookman Old Style" w:cs="Arial"/>
-                <w:sz w:val="16"/>
-                <w:szCs w:val="16"/>
-              </w:rPr>
-              <w:t>Kirsten F. Dunham</w:t>
-            </w:r>
-          </w:p>
-          <w:p>
-            <w:pPr>
-              <w:rPr>
-                <w:rFonts w:ascii="Bookman Old Style" w:hAnsi="Bookman Old Style" w:cs="Arial"/>
-                <w:b/>
-                <w:sz w:val="16"/>
-                <w:szCs w:val="16"/>
-              </w:rPr>
-            </w:pPr>
-          </w:p>
-          <w:p>
-            <w:pPr>
-              <w:rPr>
-                <w:rFonts w:ascii="Bookman Old Style" w:hAnsi="Bookman Old Style" w:cs="Arial"/>
-                <w:b/>
-                <w:sz w:val="16"/>
-                <w:szCs w:val="16"/>
-              </w:rPr>
-            </w:pPr>
-          </w:p>
-          <w:p>
-            <w:pPr>
-              <w:rPr>
-                <w:rFonts w:ascii="Bookman Old Style" w:hAnsi="Bookman Old Style" w:cs="Arial"/>
-                <w:sz w:val="16"/>
-                <w:szCs w:val="16"/>
-              </w:rPr>
-            </w:pPr>
-            <w:r>
-              <w:rPr>
-                <w:rFonts w:ascii="Bookman Old Style" w:hAnsi="Bookman Old Style" w:cs="Arial"/>
-                <w:b/>
-                <w:sz w:val="16"/>
-                <w:szCs w:val="16"/>
-              </w:rPr>
-              <w:t>Litigation Director</w:t>
-            </w:r>
-          </w:p>
-          <w:p>
-            <w:pPr>
-              <w:rPr>
-                <w:rFonts w:ascii="Bookman Old Style" w:hAnsi="Bookman Old Style" w:cs="Arial"/>
-                <w:sz w:val="16"/>
-                <w:szCs w:val="16"/>
-              </w:rPr>
-            </w:pPr>
-            <w:r>
-              <w:rPr>
-                <w:rFonts w:ascii="Bookman Old Style" w:hAnsi="Bookman Old Style" w:cs="Arial"/>
-                <w:sz w:val="16"/>
-                <w:szCs w:val="16"/>
-              </w:rPr>
-              <w:t>M. Nichole George</w:t>
-            </w:r>
-          </w:p>
         </w:tc>
         <w:tc>
           <w:tcPr>
@@ -243,234 +152,6 @@
               <w:bottom w:val="double" w:sz="4" w:space="0" w:color="auto"/>
             </w:tcBorders>
           </w:tcPr>
-          <w:p>
-            <w:pPr>
-              <w:jc w:val="both"/>
-              <w:rPr>
-                <w:rFonts w:ascii="Bookman Old Style" w:hAnsi="Bookman Old Style" w:cs="Arial"/>
-                <w:sz w:val="16"/>
-                <w:szCs w:val="16"/>
-              </w:rPr>
-            </w:pPr>
-          </w:p>
-          <w:p>
-            <w:pPr>
-              <w:jc w:val="both"/>
-              <w:rPr>
-                <w:rFonts w:ascii="Bookman Old Style" w:hAnsi="Bookman Old Style" w:cs="Arial"/>
-                <w:b/>
-                <w:sz w:val="16"/>
-                <w:szCs w:val="16"/>
-              </w:rPr>
-            </w:pPr>
-            <w:r>
-              <w:rPr>
-                <w:rFonts w:ascii="Bookman Old Style" w:hAnsi="Bookman Old Style" w:cs="Arial"/>
-                <w:b/>
-                <w:sz w:val="16"/>
-                <w:szCs w:val="16"/>
-              </w:rPr>
-              <w:t>Staff Attorneys:</w:t>
-            </w:r>
-          </w:p>
-          <w:p>
-            <w:pPr>
-              <w:jc w:val="both"/>
-              <w:rPr>
-                <w:rFonts w:ascii="Bookman Old Style" w:hAnsi="Bookman Old Style" w:cs="Arial"/>
-                <w:sz w:val="16"/>
-                <w:szCs w:val="16"/>
-              </w:rPr>
-            </w:pPr>
-            <w:r>
-              <w:rPr>
-                <w:rFonts w:ascii="Bookman Old Style" w:hAnsi="Bookman Old Style" w:cs="Arial"/>
-                <w:sz w:val="16"/>
-                <w:szCs w:val="16"/>
-              </w:rPr>
-              <w:t>Roger W. Dyer</w:t>
-            </w:r>
-          </w:p>
-          <w:p>
-            <w:pPr>
-              <w:jc w:val="both"/>
-              <w:rPr>
-                <w:rFonts w:ascii="Bookman Old Style" w:hAnsi="Bookman Old Style" w:cs="Arial"/>
-                <w:sz w:val="16"/>
-                <w:szCs w:val="16"/>
-              </w:rPr>
-            </w:pPr>
-            <w:r>
-              <w:rPr>
-                <w:rFonts w:ascii="Bookman Old Style" w:hAnsi="Bookman Old Style" w:cs="Arial"/>
-                <w:sz w:val="16"/>
-                <w:szCs w:val="16"/>
-              </w:rPr>
-              <w:t>Ed Kolkebeck</w:t>
-            </w:r>
-          </w:p>
-          <w:p>
-            <w:pPr>
-              <w:jc w:val="both"/>
-              <w:rPr>
-                <w:rFonts w:ascii="Bookman Old Style" w:hAnsi="Bookman Old Style" w:cs="Arial"/>
-                <w:sz w:val="16"/>
-                <w:szCs w:val="16"/>
-              </w:rPr>
-            </w:pPr>
-            <w:r>
-              <w:rPr>
-                <w:rFonts w:ascii="Bookman Old Style" w:hAnsi="Bookman Old Style" w:cs="Arial"/>
-                <w:sz w:val="16"/>
-                <w:szCs w:val="16"/>
-              </w:rPr>
-              <w:t>Mary Beth Mueller</w:t>
-            </w:r>
-          </w:p>
-          <w:p>
-            <w:pPr>
-              <w:jc w:val="both"/>
-              <w:rPr>
-                <w:rFonts w:ascii="Bookman Old Style" w:hAnsi="Bookman Old Style" w:cs="Arial"/>
-                <w:sz w:val="16"/>
-                <w:szCs w:val="16"/>
-              </w:rPr>
-            </w:pPr>
-            <w:r>
-              <w:rPr>
-                <w:rFonts w:ascii="Bookman Old Style" w:hAnsi="Bookman Old Style" w:cs="Arial"/>
-                <w:sz w:val="16"/>
-                <w:szCs w:val="16"/>
-              </w:rPr>
-              <w:t>James (Jay) Barton, Jr.</w:t>
-            </w:r>
-          </w:p>
-          <w:p>
-            <w:pPr>
-              <w:jc w:val="both"/>
-              <w:rPr>
-                <w:rFonts w:ascii="Bookman Old Style" w:hAnsi="Bookman Old Style" w:cs="Arial"/>
-                <w:sz w:val="16"/>
-                <w:szCs w:val="16"/>
-              </w:rPr>
-            </w:pPr>
-            <w:r>
-              <w:rPr>
-                <w:rFonts w:ascii="Bookman Old Style" w:hAnsi="Bookman Old Style" w:cs="Arial"/>
-                <w:sz w:val="16"/>
-                <w:szCs w:val="16"/>
-              </w:rPr>
-              <w:t>Garnett Matthews</w:t>
-            </w:r>
-          </w:p>
-          <w:p>
-            <w:pPr>
-              <w:jc w:val="both"/>
-              <w:rPr>
-                <w:rFonts w:ascii="Bookman Old Style" w:hAnsi="Bookman Old Style" w:cs="Arial"/>
-                <w:sz w:val="16"/>
-                <w:szCs w:val="16"/>
-              </w:rPr>
-            </w:pPr>
-            <w:r>
-              <w:rPr>
-                <w:rFonts w:ascii="Bookman Old Style" w:hAnsi="Bookman Old Style" w:cs="Arial"/>
-                <w:sz w:val="16"/>
-                <w:szCs w:val="16"/>
-              </w:rPr>
-              <w:t>Laura Maring</w:t>
-            </w:r>
-          </w:p>
-          <w:p>
-            <w:pPr>
-              <w:jc w:val="both"/>
-              <w:rPr>
-                <w:rFonts w:ascii="Bookman Old Style" w:hAnsi="Bookman Old Style" w:cs="Arial"/>
-                <w:sz w:val="16"/>
-                <w:szCs w:val="16"/>
-              </w:rPr>
-            </w:pPr>
-            <w:r>
-              <w:rPr>
-                <w:rFonts w:ascii="Bookman Old Style" w:hAnsi="Bookman Old Style" w:cs="Arial"/>
-                <w:sz w:val="16"/>
-                <w:szCs w:val="16"/>
-              </w:rPr>
-              <w:t>Patricia J. Fowler</w:t>
-            </w:r>
-          </w:p>
-          <w:p>
-            <w:pPr>
-              <w:jc w:val="both"/>
-              <w:rPr>
-                <w:rFonts w:ascii="Bookman Old Style" w:hAnsi="Bookman Old Style" w:cs="Arial"/>
-                <w:sz w:val="16"/>
-                <w:szCs w:val="16"/>
-              </w:rPr>
-            </w:pPr>
-            <w:r>
-              <w:rPr>
-                <w:rFonts w:ascii="Bookman Old Style" w:hAnsi="Bookman Old Style" w:cs="Arial"/>
-                <w:sz w:val="16"/>
-                <w:szCs w:val="16"/>
-              </w:rPr>
-              <w:t>Heather K. Ford</w:t>
-            </w:r>
-          </w:p>
-          <w:p>
-            <w:pPr>
-              <w:jc w:val="both"/>
-              <w:rPr>
-                <w:rFonts w:ascii="Bookman Old Style" w:hAnsi="Bookman Old Style" w:cs="Arial"/>
-                <w:sz w:val="16"/>
-                <w:szCs w:val="16"/>
-              </w:rPr>
-            </w:pPr>
-            <w:r>
-              <w:rPr>
-                <w:rFonts w:ascii="Bookman Old Style" w:hAnsi="Bookman Old Style" w:cs="Arial"/>
-                <w:sz w:val="16"/>
-                <w:szCs w:val="16"/>
-              </w:rPr>
-              <w:t>Kennedy P. Womack</w:t>
-            </w:r>
-          </w:p>
-          <w:p>
-            <w:pPr>
-              <w:jc w:val="both"/>
-              <w:rPr>
-                <w:rFonts w:ascii="Bookman Old Style" w:hAnsi="Bookman Old Style" w:cs="Arial"/>
-                <w:sz w:val="16"/>
-                <w:szCs w:val="16"/>
-              </w:rPr>
-            </w:pPr>
-            <w:r>
-              <w:rPr>
-                <w:rFonts w:ascii="Bookman Old Style" w:hAnsi="Bookman Old Style" w:cs="Arial"/>
-                <w:sz w:val="16"/>
-                <w:szCs w:val="16"/>
-              </w:rPr>
-              <w:t>Chris Dunn</w:t>
-            </w:r>
-          </w:p>
-          <w:p>
-            <w:pPr>
-              <w:jc w:val="both"/>
-              <w:rPr>
-                <w:rFonts w:ascii="Bookman Old Style" w:hAnsi="Bookman Old Style" w:cs="Arial"/>
-                <w:sz w:val="16"/>
-                <w:szCs w:val="16"/>
-              </w:rPr>
-            </w:pPr>
-            <w:r>
-              <w:rPr>
-                <w:rFonts w:ascii="Bookman Old Style" w:hAnsi="Bookman Old Style" w:cs="Arial"/>
-                <w:sz w:val="16"/>
-                <w:szCs w:val="16"/>
-              </w:rPr>
-              <w:t>William B. Payne</w:t>
-            </w:r>
-          </w:p>
           <w:p>
             <w:pPr>
               <w:jc w:val="both"/>
@@ -600,7 +281,7 @@
                 <w:sz w:val="16"/>
                 <w:szCs w:val="16"/>
               </w:rPr>
-              <w:t>(800) 568-4931</w:t>
+              <w:t>(800) 555-0000</w:t>
             </w:r>
           </w:p>
         </w:tc>
@@ -654,7 +335,7 @@
                 <w:sz w:val="16"/>
                 <w:szCs w:val="16"/>
               </w:rPr>
-              <w:t>428 E. Capitol, Ste #200</w:t>
+              <w:t>456 Legal Avenue, Suite 200</w:t>
             </w:r>
           </w:p>
           <w:p>
@@ -723,7 +404,7 @@
                 <w:sz w:val="16"/>
                 <w:szCs w:val="16"/>
               </w:rPr>
-              <w:t>(800) 568-4931</w:t>
+              <w:t>(800) 555-0000</w:t>
             </w:r>
           </w:p>
         </w:tc>

</xml_diff>